<commit_message>
Phase 9 & 10: Embed verified screenshots in report, finalize documentation, and complete audit
</commit_message>
<xml_diff>
--- a/report/Flight_Booking_System_Report.docx
+++ b/report/Flight_Booking_System_Report.docx
@@ -4462,7 +4462,43 @@
           <w:i w:val="0"/>
           <w:sz w:val="22"/>
         </w:rPr>
-        <w:t>Screenshots are stored in the screenshots/ directory. They show genuine application output connected to the MySQL database.</w:t>
+        <w:t>This section presents genuine application screenshots captured from the live Tkinter frontend connected to the MySQL database (flight_booking_db). Each figure includes a descriptive caption explaining the user interface elements and the database records retrieved. For features where a dedicated separate screen was not captured, the functionality and underlying database operations are described directly using real automated test results and verified SQL query execution outputs.</w:t>
+      </w:r>
+    </w:p>
+    <w:p>
+      <w:r>
+        <w:drawing>
+          <wp:inline xmlns:a="http://schemas.openxmlformats.org/drawingml/2006/main" xmlns:pic="http://schemas.openxmlformats.org/drawingml/2006/picture">
+            <wp:extent cx="5303520" cy="3449092"/>
+            <wp:docPr id="1" name="Picture 1"/>
+            <wp:cNvGraphicFramePr>
+              <a:graphicFrameLocks noChangeAspect="1"/>
+            </wp:cNvGraphicFramePr>
+            <a:graphic>
+              <a:graphicData uri="http://schemas.openxmlformats.org/drawingml/2006/picture">
+                <pic:pic>
+                  <pic:nvPicPr>
+                    <pic:cNvPr id="0" name="01_dashboard.png"/>
+                    <pic:cNvPicPr/>
+                  </pic:nvPicPr>
+                  <pic:blipFill>
+                    <a:blip r:embed="rId9"/>
+                    <a:stretch>
+                      <a:fillRect/>
+                    </a:stretch>
+                  </pic:blipFill>
+                  <pic:spPr>
+                    <a:xfrm>
+                      <a:off x="0" y="0"/>
+                      <a:ext cx="5303520" cy="3449092"/>
+                    </a:xfrm>
+                    <a:prstGeom prst="rect"/>
+                  </pic:spPr>
+                </pic:pic>
+              </a:graphicData>
+            </a:graphic>
+          </wp:inline>
+        </w:drawing>
       </w:r>
     </w:p>
     <w:p>
@@ -4472,7 +4508,644 @@
           <w:i/>
           <w:sz w:val="22"/>
         </w:rPr>
-        <w:t>[Screenshots will be inserted here. Capture them with Cmd+Shift+4 and save as screenshots/01_dashboard.png, 02_flight_search.png, etc. Then re-run: python3 src/generate_report.py]</w:t>
+        <w:t>Figure 1: Application Dashboard with Live Database Statistics (3 Airlines, 10 Flights, 10 Passengers, 13 Bookings, and Total Revenue of ₹ 49,280.00) and Upcoming Flights Table</w:t>
+      </w:r>
+    </w:p>
+    <w:p/>
+    <w:p>
+      <w:r>
+        <w:drawing>
+          <wp:inline xmlns:a="http://schemas.openxmlformats.org/drawingml/2006/main" xmlns:pic="http://schemas.openxmlformats.org/drawingml/2006/picture">
+            <wp:extent cx="5303520" cy="3449092"/>
+            <wp:docPr id="2" name="Picture 2"/>
+            <wp:cNvGraphicFramePr>
+              <a:graphicFrameLocks noChangeAspect="1"/>
+            </wp:cNvGraphicFramePr>
+            <a:graphic>
+              <a:graphicData uri="http://schemas.openxmlformats.org/drawingml/2006/picture">
+                <pic:pic>
+                  <pic:nvPicPr>
+                    <pic:cNvPr id="0" name="02_flight_search_form.png"/>
+                    <pic:cNvPicPr/>
+                  </pic:nvPicPr>
+                  <pic:blipFill>
+                    <a:blip r:embed="rId10"/>
+                    <a:stretch>
+                      <a:fillRect/>
+                    </a:stretch>
+                  </pic:blipFill>
+                  <pic:spPr>
+                    <a:xfrm>
+                      <a:off x="0" y="0"/>
+                      <a:ext cx="5303520" cy="3449092"/>
+                    </a:xfrm>
+                    <a:prstGeom prst="rect"/>
+                  </pic:spPr>
+                </pic:pic>
+              </a:graphicData>
+            </a:graphic>
+          </wp:inline>
+        </w:drawing>
+      </w:r>
+    </w:p>
+    <w:p>
+      <w:r>
+        <w:rPr>
+          <w:b w:val="0"/>
+          <w:i/>
+          <w:sz w:val="22"/>
+        </w:rPr>
+        <w:t>Figure 2: Flight Search Input Interface with Origin, Destination, Travel Date (2026-10-28), and Travel Class Selection Dropdown</w:t>
+      </w:r>
+    </w:p>
+    <w:p/>
+    <w:p>
+      <w:r>
+        <w:drawing>
+          <wp:inline xmlns:a="http://schemas.openxmlformats.org/drawingml/2006/main" xmlns:pic="http://schemas.openxmlformats.org/drawingml/2006/picture">
+            <wp:extent cx="5303520" cy="3449092"/>
+            <wp:docPr id="3" name="Picture 3"/>
+            <wp:cNvGraphicFramePr>
+              <a:graphicFrameLocks noChangeAspect="1"/>
+            </wp:cNvGraphicFramePr>
+            <a:graphic>
+              <a:graphicData uri="http://schemas.openxmlformats.org/drawingml/2006/picture">
+                <pic:pic>
+                  <pic:nvPicPr>
+                    <pic:cNvPr id="0" name="03_flight_search_results.png"/>
+                    <pic:cNvPicPr/>
+                  </pic:nvPicPr>
+                  <pic:blipFill>
+                    <a:blip r:embed="rId11"/>
+                    <a:stretch>
+                      <a:fillRect/>
+                    </a:stretch>
+                  </pic:blipFill>
+                  <pic:spPr>
+                    <a:xfrm>
+                      <a:off x="0" y="0"/>
+                      <a:ext cx="5303520" cy="3449092"/>
+                    </a:xfrm>
+                    <a:prstGeom prst="rect"/>
+                  </pic:spPr>
+                </pic:pic>
+              </a:graphicData>
+            </a:graphic>
+          </wp:inline>
+        </w:drawing>
+      </w:r>
+    </w:p>
+    <w:p>
+      <w:r>
+        <w:rPr>
+          <w:b w:val="0"/>
+          <w:i/>
+          <w:sz w:val="22"/>
+        </w:rPr>
+        <w:t>Figure 3: Flight Search Query Results for New Delhi (DEL) to Mumbai (BOM) on 2026-11-05 Displaying Flight 6E-201, 2h 10m Duration, ₹ 3,500.00 Base Fare, and 166 Available Seats</w:t>
+      </w:r>
+    </w:p>
+    <w:p/>
+    <w:p>
+      <w:r>
+        <w:drawing>
+          <wp:inline xmlns:a="http://schemas.openxmlformats.org/drawingml/2006/main" xmlns:pic="http://schemas.openxmlformats.org/drawingml/2006/picture">
+            <wp:extent cx="5303520" cy="3449092"/>
+            <wp:docPr id="4" name="Picture 4"/>
+            <wp:cNvGraphicFramePr>
+              <a:graphicFrameLocks noChangeAspect="1"/>
+            </wp:cNvGraphicFramePr>
+            <a:graphic>
+              <a:graphicData uri="http://schemas.openxmlformats.org/drawingml/2006/picture">
+                <pic:pic>
+                  <pic:nvPicPr>
+                    <pic:cNvPr id="0" name="05_passenger_list.png"/>
+                    <pic:cNvPicPr/>
+                  </pic:nvPicPr>
+                  <pic:blipFill>
+                    <a:blip r:embed="rId12"/>
+                    <a:stretch>
+                      <a:fillRect/>
+                    </a:stretch>
+                  </pic:blipFill>
+                  <pic:spPr>
+                    <a:xfrm>
+                      <a:off x="0" y="0"/>
+                      <a:ext cx="5303520" cy="3449092"/>
+                    </a:xfrm>
+                    <a:prstGeom prst="rect"/>
+                  </pic:spPr>
+                </pic:pic>
+              </a:graphicData>
+            </a:graphic>
+          </wp:inline>
+        </w:drawing>
+      </w:r>
+    </w:p>
+    <w:p>
+      <w:r>
+        <w:rPr>
+          <w:b w:val="0"/>
+          <w:i/>
+          <w:sz w:val="22"/>
+        </w:rPr>
+        <w:t>Figure 4: Passenger Management Screen Displaying Passenger Details Entry Form (Left) and Live Passenger Table Retrieved from MySQL (Right)</w:t>
+      </w:r>
+    </w:p>
+    <w:p/>
+    <w:p>
+      <w:r>
+        <w:drawing>
+          <wp:inline xmlns:a="http://schemas.openxmlformats.org/drawingml/2006/main" xmlns:pic="http://schemas.openxmlformats.org/drawingml/2006/picture">
+            <wp:extent cx="5303520" cy="3449092"/>
+            <wp:docPr id="5" name="Picture 5"/>
+            <wp:cNvGraphicFramePr>
+              <a:graphicFrameLocks noChangeAspect="1"/>
+            </wp:cNvGraphicFramePr>
+            <a:graphic>
+              <a:graphicData uri="http://schemas.openxmlformats.org/drawingml/2006/picture">
+                <pic:pic>
+                  <pic:nvPicPr>
+                    <pic:cNvPr id="0" name="06_booking_form.png"/>
+                    <pic:cNvPicPr/>
+                  </pic:nvPicPr>
+                  <pic:blipFill>
+                    <a:blip r:embed="rId13"/>
+                    <a:stretch>
+                      <a:fillRect/>
+                    </a:stretch>
+                  </pic:blipFill>
+                  <pic:spPr>
+                    <a:xfrm>
+                      <a:off x="0" y="0"/>
+                      <a:ext cx="5303520" cy="3449092"/>
+                    </a:xfrm>
+                    <a:prstGeom prst="rect"/>
+                  </pic:spPr>
+                </pic:pic>
+              </a:graphicData>
+            </a:graphic>
+          </wp:inline>
+        </w:drawing>
+      </w:r>
+    </w:p>
+    <w:p>
+      <w:r>
+        <w:rPr>
+          <w:b w:val="0"/>
+          <w:i/>
+          <w:sz w:val="22"/>
+        </w:rPr>
+        <w:t>Figure 5: New Booking Wizard with Flight Selection (6E-301), Passenger Selection (Arjun Sharma), Seat Allocation (E12A), Business Class Availability Check (18 / 20 Seats), and Fare Calculation (₹ 10,500.00)</w:t>
+      </w:r>
+    </w:p>
+    <w:p/>
+    <w:p>
+      <w:r>
+        <w:drawing>
+          <wp:inline xmlns:a="http://schemas.openxmlformats.org/drawingml/2006/main" xmlns:pic="http://schemas.openxmlformats.org/drawingml/2006/picture">
+            <wp:extent cx="5303520" cy="3449092"/>
+            <wp:docPr id="6" name="Picture 6"/>
+            <wp:cNvGraphicFramePr>
+              <a:graphicFrameLocks noChangeAspect="1"/>
+            </wp:cNvGraphicFramePr>
+            <a:graphic>
+              <a:graphicData uri="http://schemas.openxmlformats.org/drawingml/2006/picture">
+                <pic:pic>
+                  <pic:nvPicPr>
+                    <pic:cNvPr id="0" name="07_booking_confirmed.png"/>
+                    <pic:cNvPicPr/>
+                  </pic:nvPicPr>
+                  <pic:blipFill>
+                    <a:blip r:embed="rId14"/>
+                    <a:stretch>
+                      <a:fillRect/>
+                    </a:stretch>
+                  </pic:blipFill>
+                  <pic:spPr>
+                    <a:xfrm>
+                      <a:off x="0" y="0"/>
+                      <a:ext cx="5303520" cy="3449092"/>
+                    </a:xfrm>
+                    <a:prstGeom prst="rect"/>
+                  </pic:spPr>
+                </pic:pic>
+              </a:graphicData>
+            </a:graphic>
+          </wp:inline>
+        </w:drawing>
+      </w:r>
+    </w:p>
+    <w:p>
+      <w:r>
+        <w:rPr>
+          <w:b w:val="0"/>
+          <w:i/>
+          <w:sz w:val="22"/>
+        </w:rPr>
+        <w:t>Figure 6: Booking Detail View Displaying Confirmed Reservation (Booking Reference: BK2MV3U0), Active Ticket Record, and Initial Status History Audit Entry ('Booking created')</w:t>
+      </w:r>
+    </w:p>
+    <w:p/>
+    <w:p>
+      <w:r>
+        <w:drawing>
+          <wp:inline xmlns:a="http://schemas.openxmlformats.org/drawingml/2006/main" xmlns:pic="http://schemas.openxmlformats.org/drawingml/2006/picture">
+            <wp:extent cx="5303520" cy="3449092"/>
+            <wp:docPr id="7" name="Picture 7"/>
+            <wp:cNvGraphicFramePr>
+              <a:graphicFrameLocks noChangeAspect="1"/>
+            </wp:cNvGraphicFramePr>
+            <a:graphic>
+              <a:graphicData uri="http://schemas.openxmlformats.org/drawingml/2006/picture">
+                <pic:pic>
+                  <pic:nvPicPr>
+                    <pic:cNvPr id="0" name="08_booking_list.png"/>
+                    <pic:cNvPicPr/>
+                  </pic:nvPicPr>
+                  <pic:blipFill>
+                    <a:blip r:embed="rId15"/>
+                    <a:stretch>
+                      <a:fillRect/>
+                    </a:stretch>
+                  </pic:blipFill>
+                  <pic:spPr>
+                    <a:xfrm>
+                      <a:off x="0" y="0"/>
+                      <a:ext cx="5303520" cy="3449092"/>
+                    </a:xfrm>
+                    <a:prstGeom prst="rect"/>
+                  </pic:spPr>
+                </pic:pic>
+              </a:graphicData>
+            </a:graphic>
+          </wp:inline>
+        </w:drawing>
+      </w:r>
+    </w:p>
+    <w:p>
+      <w:r>
+        <w:rPr>
+          <w:b w:val="0"/>
+          <w:i/>
+          <w:sz w:val="22"/>
+        </w:rPr>
+        <w:t>Figure 7: All Bookings List Displaying Live Reservation Records with Unique References (e.g., BK2MV3U0, BKTEST01, BK012HIJ), Passenger Names, Amounts, and Booking Statuses</w:t>
+      </w:r>
+    </w:p>
+    <w:p/>
+    <w:p>
+      <w:r>
+        <w:drawing>
+          <wp:inline xmlns:a="http://schemas.openxmlformats.org/drawingml/2006/main" xmlns:pic="http://schemas.openxmlformats.org/drawingml/2006/picture">
+            <wp:extent cx="5303520" cy="3449092"/>
+            <wp:docPr id="8" name="Picture 8"/>
+            <wp:cNvGraphicFramePr>
+              <a:graphicFrameLocks noChangeAspect="1"/>
+            </wp:cNvGraphicFramePr>
+            <a:graphic>
+              <a:graphicData uri="http://schemas.openxmlformats.org/drawingml/2006/picture">
+                <pic:pic>
+                  <pic:nvPicPr>
+                    <pic:cNvPr id="0" name="10_cancellation.png"/>
+                    <pic:cNvPicPr/>
+                  </pic:nvPicPr>
+                  <pic:blipFill>
+                    <a:blip r:embed="rId16"/>
+                    <a:stretch>
+                      <a:fillRect/>
+                    </a:stretch>
+                  </pic:blipFill>
+                  <pic:spPr>
+                    <a:xfrm>
+                      <a:off x="0" y="0"/>
+                      <a:ext cx="5303520" cy="3449092"/>
+                    </a:xfrm>
+                    <a:prstGeom prst="rect"/>
+                  </pic:spPr>
+                </pic:pic>
+              </a:graphicData>
+            </a:graphic>
+          </wp:inline>
+        </w:drawing>
+      </w:r>
+    </w:p>
+    <w:p>
+      <w:r>
+        <w:rPr>
+          <w:b w:val="0"/>
+          <w:i/>
+          <w:sz w:val="22"/>
+        </w:rPr>
+        <w:t>Figure 8: Booking Cancellation Result for Reservation BK2MV3U0 Showing Booking Status Changed to Cancelled, Ticket Status Cancelled, and Audit History Logging Transition at 2026-10-28 21:40:30</w:t>
+      </w:r>
+    </w:p>
+    <w:p/>
+    <w:p>
+      <w:r>
+        <w:drawing>
+          <wp:inline xmlns:a="http://schemas.openxmlformats.org/drawingml/2006/main" xmlns:pic="http://schemas.openxmlformats.org/drawingml/2006/picture">
+            <wp:extent cx="5303520" cy="3449092"/>
+            <wp:docPr id="9" name="Picture 9"/>
+            <wp:cNvGraphicFramePr>
+              <a:graphicFrameLocks noChangeAspect="1"/>
+            </wp:cNvGraphicFramePr>
+            <a:graphic>
+              <a:graphicData uri="http://schemas.openxmlformats.org/drawingml/2006/picture">
+                <pic:pic>
+                  <pic:nvPicPr>
+                    <pic:cNvPr id="0" name="11_payments.png"/>
+                    <pic:cNvPicPr/>
+                  </pic:nvPicPr>
+                  <pic:blipFill>
+                    <a:blip r:embed="rId17"/>
+                    <a:stretch>
+                      <a:fillRect/>
+                    </a:stretch>
+                  </pic:blipFill>
+                  <pic:spPr>
+                    <a:xfrm>
+                      <a:off x="0" y="0"/>
+                      <a:ext cx="5303520" cy="3449092"/>
+                    </a:xfrm>
+                    <a:prstGeom prst="rect"/>
+                  </pic:spPr>
+                </pic:pic>
+              </a:graphicData>
+            </a:graphic>
+          </wp:inline>
+        </w:drawing>
+      </w:r>
+    </w:p>
+    <w:p>
+      <w:r>
+        <w:rPr>
+          <w:b w:val="0"/>
+          <w:i/>
+          <w:sz w:val="22"/>
+        </w:rPr>
+        <w:t>Figure 9: Payment Records Module Showing Simulated Payment Form and Live Transactions Table Detailing Booking References, Methods (UPI, Credit Card, Debit Card, Net Banking, Wallet), and Completed/Refunded Statuses</w:t>
+      </w:r>
+    </w:p>
+    <w:p/>
+    <w:p>
+      <w:r>
+        <w:drawing>
+          <wp:inline xmlns:a="http://schemas.openxmlformats.org/drawingml/2006/main" xmlns:pic="http://schemas.openxmlformats.org/drawingml/2006/picture">
+            <wp:extent cx="5303520" cy="3449092"/>
+            <wp:docPr id="10" name="Picture 10"/>
+            <wp:cNvGraphicFramePr>
+              <a:graphicFrameLocks noChangeAspect="1"/>
+            </wp:cNvGraphicFramePr>
+            <a:graphic>
+              <a:graphicData uri="http://schemas.openxmlformats.org/drawingml/2006/picture">
+                <pic:pic>
+                  <pic:nvPicPr>
+                    <pic:cNvPr id="0" name="12_revenue_report.png"/>
+                    <pic:cNvPicPr/>
+                  </pic:nvPicPr>
+                  <pic:blipFill>
+                    <a:blip r:embed="rId18"/>
+                    <a:stretch>
+                      <a:fillRect/>
+                    </a:stretch>
+                  </pic:blipFill>
+                  <pic:spPr>
+                    <a:xfrm>
+                      <a:off x="0" y="0"/>
+                      <a:ext cx="5303520" cy="3449092"/>
+                    </a:xfrm>
+                    <a:prstGeom prst="rect"/>
+                  </pic:spPr>
+                </pic:pic>
+              </a:graphicData>
+            </a:graphic>
+          </wp:inline>
+        </w:drawing>
+      </w:r>
+    </w:p>
+    <w:p>
+      <w:r>
+        <w:rPr>
+          <w:b w:val="0"/>
+          <w:i/>
+          <w:sz w:val="22"/>
+        </w:rPr>
+        <w:t>Figure 10: Revenue by Airline Analytical Report Generated via SQL Aggregation (IndiGo: 6 bookings / ₹ 28,160.00; Air India: 3 bookings / ₹ 14,190.00; SpiceJet: 2 bookings / ₹ 6,930.00)</w:t>
+      </w:r>
+    </w:p>
+    <w:p/>
+    <w:p>
+      <w:r>
+        <w:drawing>
+          <wp:inline xmlns:a="http://schemas.openxmlformats.org/drawingml/2006/main" xmlns:pic="http://schemas.openxmlformats.org/drawingml/2006/picture">
+            <wp:extent cx="5303520" cy="3449092"/>
+            <wp:docPr id="11" name="Picture 11"/>
+            <wp:cNvGraphicFramePr>
+              <a:graphicFrameLocks noChangeAspect="1"/>
+            </wp:cNvGraphicFramePr>
+            <a:graphic>
+              <a:graphicData uri="http://schemas.openxmlformats.org/drawingml/2006/picture">
+                <pic:pic>
+                  <pic:nvPicPr>
+                    <pic:cNvPr id="0" name="13_occupancy_report.png"/>
+                    <pic:cNvPicPr/>
+                  </pic:nvPicPr>
+                  <pic:blipFill>
+                    <a:blip r:embed="rId19"/>
+                    <a:stretch>
+                      <a:fillRect/>
+                    </a:stretch>
+                  </pic:blipFill>
+                  <pic:spPr>
+                    <a:xfrm>
+                      <a:off x="0" y="0"/>
+                      <a:ext cx="5303520" cy="3449092"/>
+                    </a:xfrm>
+                    <a:prstGeom prst="rect"/>
+                  </pic:spPr>
+                </pic:pic>
+              </a:graphicData>
+            </a:graphic>
+          </wp:inline>
+        </w:drawing>
+      </w:r>
+    </w:p>
+    <w:p>
+      <w:r>
+        <w:rPr>
+          <w:b w:val="0"/>
+          <w:i/>
+          <w:sz w:val="22"/>
+        </w:rPr>
+        <w:t>Figure 11: Flight Occupancy Report Displaying Aircraft Capacity, Tickets Sold, and Occupancy Percentage Calculated by SQL Query Across Scheduled Routes</w:t>
+      </w:r>
+    </w:p>
+    <w:p/>
+    <w:p>
+      <w:r>
+        <w:drawing>
+          <wp:inline xmlns:a="http://schemas.openxmlformats.org/drawingml/2006/main" xmlns:pic="http://schemas.openxmlformats.org/drawingml/2006/picture">
+            <wp:extent cx="5303520" cy="3449092"/>
+            <wp:docPr id="12" name="Picture 12"/>
+            <wp:cNvGraphicFramePr>
+              <a:graphicFrameLocks noChangeAspect="1"/>
+            </wp:cNvGraphicFramePr>
+            <a:graphic>
+              <a:graphicData uri="http://schemas.openxmlformats.org/drawingml/2006/picture">
+                <pic:pic>
+                  <pic:nvPicPr>
+                    <pic:cNvPr id="0" name="14_admin_schedules.png"/>
+                    <pic:cNvPicPr/>
+                  </pic:nvPicPr>
+                  <pic:blipFill>
+                    <a:blip r:embed="rId20"/>
+                    <a:stretch>
+                      <a:fillRect/>
+                    </a:stretch>
+                  </pic:blipFill>
+                  <pic:spPr>
+                    <a:xfrm>
+                      <a:off x="0" y="0"/>
+                      <a:ext cx="5303520" cy="3449092"/>
+                    </a:xfrm>
+                    <a:prstGeom prst="rect"/>
+                  </pic:spPr>
+                </pic:pic>
+              </a:graphicData>
+            </a:graphic>
+          </wp:inline>
+        </w:drawing>
+      </w:r>
+    </w:p>
+    <w:p>
+      <w:r>
+        <w:rPr>
+          <w:b w:val="0"/>
+          <w:i/>
+          <w:sz w:val="22"/>
+        </w:rPr>
+        <w:t>Figure 12: Flight Schedules Report under Reports Module Displaying Operating Routes, Flight Numbers, Departure/Arrival Timestamps, Base Fares, and Scheduled/Cancelled Statuses</w:t>
+      </w:r>
+    </w:p>
+    <w:p/>
+    <w:p>
+      <w:pPr>
+        <w:pStyle w:val="Heading2"/>
+        <w:jc w:val="left"/>
+      </w:pPr>
+      <w:r>
+        <w:t>Verification of Features Without Standalone Screenshots</w:t>
+      </w:r>
+    </w:p>
+    <w:p>
+      <w:r>
+        <w:rPr>
+          <w:b w:val="0"/>
+          <w:i w:val="0"/>
+          <w:sz w:val="22"/>
+        </w:rPr>
+        <w:t>The following planned screen captures were integrated into existing interface views or verified through genuine automated test executions and SQL query outputs rather than separate standalone images:</w:t>
+      </w:r>
+    </w:p>
+    <w:p>
+      <w:r>
+        <w:rPr>
+          <w:b/>
+          <w:i w:val="0"/>
+          <w:sz w:val="22"/>
+        </w:rPr>
+        <w:t>1. Passenger Registration Workflow (Integrated in Passenger Management):</w:t>
+      </w:r>
+    </w:p>
+    <w:p>
+      <w:r>
+        <w:rPr>
+          <w:b w:val="0"/>
+          <w:i w:val="0"/>
+          <w:sz w:val="22"/>
+        </w:rPr>
+        <w:t>In the desktop application architecture, the passenger registration form is positioned side-by-side with the live passenger table inside the Passenger Management interface (shown in Figure 4 above). Passenger creation was verified in automated test TC06 (test_TC06PassengerRegistration::test_add_and_retrieve). Execution result:</w:t>
+        <w:br/>
+        <w:t>• Function: add_passenger('Test User TC06', 'tc06.test@sample.com', '9100000006', '1995-01-01')</w:t>
+        <w:br/>
+        <w:t>• SQL executed: INSERT INTO passengers (full_name, email, phone, date_of_birth) VALUES (...)</w:t>
+        <w:br/>
+        <w:t>• Database Response: Returned auto-increment passenger_id &gt; 0; record verified via SELECT * FROM passengers WHERE passenger_id = pid.</w:t>
+        <w:br/>
+        <w:t>• Status: PASSED (verified persistence and constraint integrity).</w:t>
+      </w:r>
+    </w:p>
+    <w:p>
+      <w:r>
+        <w:rPr>
+          <w:b/>
+          <w:i w:val="0"/>
+          <w:sz w:val="22"/>
+        </w:rPr>
+        <w:t>2. Booking Detail and Ticket Lookup View:</w:t>
+      </w:r>
+    </w:p>
+    <w:p>
+      <w:r>
+        <w:rPr>
+          <w:b w:val="0"/>
+          <w:i w:val="0"/>
+          <w:sz w:val="22"/>
+        </w:rPr>
+        <w:t>The Booking Detail tab was captured directly after booking confirmation (Figure 6) and following cancellation (Figure 8). The underlying query logic was also verified in automated test TC18 (test_TC18_join_query) which executes a multi-table INNER JOIN across bookings, passengers, tickets, flight_schedules, airlines, and airports for booking reference 'BK001ABC'. Execution result:</w:t>
+        <w:br/>
+        <w:t>• Passenger Name: Arjun Sharma</w:t>
+        <w:br/>
+        <w:t>• Airline &amp; Flight: IndiGo Airlines (6E-201)</w:t>
+        <w:br/>
+        <w:t>• Route: New Delhi (DEL) → Mumbai (BOM)</w:t>
+        <w:br/>
+        <w:t>• Status: PASSED (verified multi-table relational join accuracy).</w:t>
+      </w:r>
+    </w:p>
+    <w:p>
+      <w:r>
+        <w:rPr>
+          <w:b/>
+          <w:i w:val="0"/>
+          <w:sz w:val="22"/>
+        </w:rPr>
+        <w:t>3. Seat Availability &amp; Double-Booking Prevention Validation:</w:t>
+      </w:r>
+    </w:p>
+    <w:p>
+      <w:r>
+        <w:rPr>
+          <w:b w:val="0"/>
+          <w:i w:val="0"/>
+          <w:sz w:val="22"/>
+        </w:rPr>
+        <w:t>Double-booking prevention is enforced at the database level by the UNIQUE (flight_id, seat_number) constraint on the tickets table and the trg_check_seat_capacity trigger. This was rigorously verified in automated tests TC09 and TC10:</w:t>
+        <w:br/>
+        <w:t>• Test TC09 (test_TC09DuplicateSeat::test_duplicate_seat_rejected): Attempting to assign the same seat (E36A) to a second passenger on flight 9 resulted in an immediate IntegrityError / RuntimeError: 'Duplicate entry for key uq_flight_seat'. Status: PASSED.</w:t>
+        <w:br/>
+        <w:t>• Test TC10 (test_TC10_capacity_overflow): Filling all Business seats on flight 7 and attempting one additional booking triggered trigger trg_check_seat_capacity, raising SQLSTATE 45000: 'No seats available in the selected travel class'. Status: PASSED.</w:t>
+      </w:r>
+    </w:p>
+    <w:p>
+      <w:r>
+        <w:rPr>
+          <w:b/>
+          <w:i w:val="0"/>
+          <w:sz w:val="22"/>
+        </w:rPr>
+        <w:t>4. Flight and Booking Cancellation Seat Release:</w:t>
+      </w:r>
+    </w:p>
+    <w:p>
+      <w:r>
+        <w:rPr>
+          <w:b w:val="0"/>
+          <w:i w:val="0"/>
+          <w:sz w:val="22"/>
+        </w:rPr>
+        <w:t>Seat release following booking cancellation was verified in automated test TC16 (TestTC15TC16CancellationAndSeatRelease::test_TC16_seat_release). When cancel_booking() was executed, all associated ticket rows had their ticket_status updated to 'Cancelled', making the seat immediately available again for subsequent flight searches. Status: PASSED.</w:t>
       </w:r>
     </w:p>
     <w:p>

</xml_diff>